<commit_message>
feat: add holdout validation dashboard page and backtesting modules for FY24-25 data
</commit_message>
<xml_diff>
--- a/EDA dashboard Python/Your_capstone_reports/Capstone Weekly Update-October 4.docx
+++ b/EDA dashboard Python/Your_capstone_reports/Capstone Weekly Update-October 4.docx
@@ -190,9 +190,9 @@
               </w:rPr>
               <w:t>1. Probabilistic Inventory Optimization Engine:</w:t>
               <w:br/>
-              <w:t xml:space="preserve">  • Definitive Replenishment Formulations: Implemented src/inventory/inventory_engine.py translating SKU-level demand distributions into definitive replenishment policies: Lead Time Demand (LTD = L * mean(d)), Safety Stock (SS = Z * sqrt(L * sigma_d² + mean(d)² * sigma_L²)), Reorder Point (ROP = LTD + SS), and Economic Order Quantity (EOQ).</w:t>
+              <w:t xml:space="preserve">  • Definitive Replenishment Formulations: Implemented src/inventory/inventory_engine.py translating SKU-level demand distributions into definitive replenishment policies: Lead Time Demand (LTD = forecast demand over the next L weeks), Safety Stock (SS = Z * sqrt(L) * sigma), and Reorder Point (ROP = LTD + SS).</w:t>
               <w:br/>
-              <w:t xml:space="preserve">  • Empirical Variance Derivation: Derived error dispersion sigma_LTD directly from empirical walk-forward backtest RMSE residuals rather than assuming theoretical Gaussian stationarity.</w:t>
+              <w:t xml:space="preserve">  • Empirical Variance Derivation: Derived the weekly error dispersion sigma from the champion's out-of-sample walk-forward backtest residuals (falling back to backtest RMSE), so sigma_LTD = sqrt(L) * sigma reflects measured forecast error rather than raw demand variability.</w:t>
               <w:br/>
               <w:t xml:space="preserve">  • Stockout Risk Modeling: Evaluated stockout probability via Monte Carlo path simulations and parametric normal survival functions across 90%, 95%, and 98% service level targets.</w:t>
               <w:br/>
@@ -200,7 +200,7 @@
               <w:br/>
               <w:t>2. Uncertainty Quantification &amp; Conformal Prediction Intervals:</w:t>
               <w:br/>
-              <w:t xml:space="preserve">  • Distribution-Free Conformal Intervals: Developed src/uncertainty/prediction_intervals.py providing distribution-free conformal prediction intervals.</w:t>
+              <w:t xml:space="preserve">  • Distribution-Free Conformal Intervals: Developed src/uncertainty/prediction_intervals.py providing distribution-free split-conformal prediction intervals, level-scaled from the champion's out-of-sample backtest residuals so they widen in peak season and narrow in the trough.</w:t>
               <w:br/>
               <w:t xml:space="preserve">  • P10 / P50 / P90 Uncertainty Envelopes: Generated calibrated P10 (bearish floor / downside risk), P50 (median operational plan), and P90 (bullish ceiling / peak season capacity requirements) prediction intervals.</w:t>
               <w:br/>
@@ -208,13 +208,13 @@
               <w:br/>
               <w:t>3. What-If Scenario Stress Testing &amp; Simulation Engine:</w:t>
               <w:br/>
-              <w:t xml:space="preserve">  • Dynamic Operational Stress Tests: Built src/scenarios/simulator.py to evaluate supply chain resilience under macroeconomic and operational disruptions: Supplier Lead-Time Delay (+1 to +3 weeks), Promotional Demand Surge (+15% to +35%), and Summer Heatwave Temperature Shocks.</w:t>
+              <w:t xml:space="preserve">  • Dynamic Operational Stress Tests: Built src/scenarios/simulator.py to evaluate supply chain resilience under planning-assumption demand scenarios (Summer Heatwave +30%, Dealer Festive Scheme +20%, Supply Chain Headwind -20%, Aggressive Market Expansion +15%, or a custom multiplier) with user-set lead time and service level.</w:t>
               <w:br/>
-              <w:t xml:space="preserve">  • Working Capital &amp; Stockout Exposure: Simulated working capital lockup, stockout probabilities, and pipeline inventory requirements under each stress condition across all 5 regional sales branches.</w:t>
+              <w:t xml:space="preserve">  • Working Capital &amp; Stockout Exposure: Recomputes safety stock, reorder point and safety-stock capital under each scenario for any of the 5 regional sales branches; stock-out risk is reported only when the user enters on-hand stock.</w:t>
               <w:br/>
               <w:t>4. Live Telemetry, Statistical Drift Radar &amp; Planner Alert Queue:</w:t>
               <w:br/>
-              <w:t xml:space="preserve">  • APICS Tracking Signal Telemetry: Developed src/monitoring/forecast_monitor.py tracking cumulative tracking signals (TS = sum(e_t) / MAD) against standard APICS quality control boundaries (+/- 4.0 warning, +/- 6.0 automatic retrain trigger).</w:t>
+              <w:t xml:space="preserve">  • APICS Tracking Signal Telemetry: Developed src/monitoring/forecast_monitor.py tracking cumulative tracking signals (TS = sum(e_t) / MAD) on the champion's latest out-of-sample backtest fold against standard APICS quality control boundaries (+/- 4.0 'Watch', beyond +/- 6.0 'Retrain Required' flag), together with accuracy degradation versus the model's earlier folds.</w:t>
               <w:br/>
               <w:t xml:space="preserve">  • Statistical Drift Radar: Implemented src/monitoring/drift.py calculating Population Stability Index (PSI) with quantile-based binning and two-sample Kolmogorov-Smirnov (KS) tests to detect demand regime shifts.</w:t>
               <w:br/>

</xml_diff>